<commit_message>
Updated the title and names on the final report document
</commit_message>
<xml_diff>
--- a/final_report.docx
+++ b/final_report.docx
@@ -1,6 +1,6 @@
 
 <file path=word/document.xml><?xml version="1.0" encoding="utf-8"?>
-<w:document xmlns:wpc="http://schemas.microsoft.com/office/word/2010/wordprocessingCanvas" xmlns:cx="http://schemas.microsoft.com/office/drawing/2014/chartex" xmlns:cx1="http://schemas.microsoft.com/office/drawing/2015/9/8/chartex" xmlns:cx2="http://schemas.microsoft.com/office/drawing/2015/10/21/chartex" xmlns:cx3="http://schemas.microsoft.com/office/drawing/2016/5/9/chartex" xmlns:cx4="http://schemas.microsoft.com/office/drawing/2016/5/10/chartex" xmlns:cx5="http://schemas.microsoft.com/office/drawing/2016/5/11/chartex" xmlns:cx6="http://schemas.microsoft.com/office/drawing/2016/5/12/chartex" xmlns:cx7="http://schemas.microsoft.com/office/drawing/2016/5/13/chartex" xmlns:cx8="http://schemas.microsoft.com/office/drawing/2016/5/14/chartex" xmlns:mc="http://schemas.openxmlformats.org/markup-compatibility/2006" xmlns:m="http://schemas.openxmlformats.org/officeDocument/2006/math" xmlns:aink="http://schemas.microsoft.com/office/drawing/2016/ink" xmlns:am3d="http://schemas.microsoft.com/office/drawing/2017/model3d" xmlns:oel="http://schemas.microsoft.com/office/2019/extlst" xmlns:r="http://schemas.openxmlformats.org/officeDocument/2006/relationships" xmlns:wp14="http://schemas.microsoft.com/office/word/2010/wordprocessingDrawing" xmlns:wp="http://schemas.openxmlformats.org/drawingml/2006/wordprocessingDrawing" xmlns:wpg="http://schemas.microsoft.com/office/word/2010/wordprocessingGroup" xmlns:wpi="http://schemas.microsoft.com/office/word/2010/wordprocessingInk" xmlns:wps="http://schemas.microsoft.com/office/word/2010/wordprocessingShape" xmlns:o="urn:schemas-microsoft-com:office:office" xmlns:v="urn:schemas-microsoft-com:vml" xmlns:w10="urn:schemas-microsoft-com:office:word" xmlns:w="http://schemas.openxmlformats.org/wordprocessingml/2006/main" xmlns:w14="http://schemas.microsoft.com/office/word/2010/wordml" xmlns:w15="http://schemas.microsoft.com/office/word/2012/wordml" xmlns:w16cei="http://schemas.microsoft.com/office/word/2026/wordml/cei" xmlns:w16cex="http://schemas.microsoft.com/office/word/2018/wordml/cex" xmlns:w16cid="http://schemas.microsoft.com/office/word/2016/wordml/cid" xmlns:w16="http://schemas.microsoft.com/office/word/2018/wordml" xmlns:w16sdtdh="http://schemas.microsoft.com/office/word/2020/wordml/sdtdatahash" xmlns:w16sdtfl="http://schemas.microsoft.com/office/word/2024/wordml/sdtformatlock" xmlns:w16se="http://schemas.microsoft.com/office/word/2015/wordml/symex" xmlns:w16du="http://schemas.microsoft.com/office/word/2023/wordml/word16du" xmlns:wne="http://schemas.microsoft.com/office/word/2006/wordml" mc:Ignorable="w14 w15 w16se w16cid w16 w16cex w16sdtdh w16sdtfl w16du wp14">
+<w:document xmlns:wpc="http://schemas.microsoft.com/office/word/2010/wordprocessingCanvas" xmlns:cx="http://schemas.microsoft.com/office/drawing/2014/chartex" xmlns:cx1="http://schemas.microsoft.com/office/drawing/2015/9/8/chartex" xmlns:cx2="http://schemas.microsoft.com/office/drawing/2015/10/21/chartex" xmlns:cx3="http://schemas.microsoft.com/office/drawing/2016/5/9/chartex" xmlns:cx4="http://schemas.microsoft.com/office/drawing/2016/5/10/chartex" xmlns:cx5="http://schemas.microsoft.com/office/drawing/2016/5/11/chartex" xmlns:cx6="http://schemas.microsoft.com/office/drawing/2016/5/12/chartex" xmlns:cx7="http://schemas.microsoft.com/office/drawing/2016/5/13/chartex" xmlns:cx8="http://schemas.microsoft.com/office/drawing/2016/5/14/chartex" xmlns:mc="http://schemas.openxmlformats.org/markup-compatibility/2006" xmlns:aink="http://schemas.microsoft.com/office/drawing/2016/ink" xmlns:am3d="http://schemas.microsoft.com/office/drawing/2017/model3d" xmlns:o="urn:schemas-microsoft-com:office:office" xmlns:oel="http://schemas.microsoft.com/office/2019/extlst" xmlns:r="http://schemas.openxmlformats.org/officeDocument/2006/relationships" xmlns:m="http://schemas.openxmlformats.org/officeDocument/2006/math" xmlns:v="urn:schemas-microsoft-com:vml" xmlns:wp14="http://schemas.microsoft.com/office/word/2010/wordprocessingDrawing" xmlns:wp="http://schemas.openxmlformats.org/drawingml/2006/wordprocessingDrawing" xmlns:w10="urn:schemas-microsoft-com:office:word" xmlns:w="http://schemas.openxmlformats.org/wordprocessingml/2006/main" xmlns:w14="http://schemas.microsoft.com/office/word/2010/wordml" xmlns:w15="http://schemas.microsoft.com/office/word/2012/wordml" xmlns:w16cex="http://schemas.microsoft.com/office/word/2018/wordml/cex" xmlns:w16cid="http://schemas.microsoft.com/office/word/2016/wordml/cid" xmlns:w16="http://schemas.microsoft.com/office/word/2018/wordml" xmlns:w16du="http://schemas.microsoft.com/office/word/2023/wordml/word16du" xmlns:w16sdtdh="http://schemas.microsoft.com/office/word/2020/wordml/sdtdatahash" xmlns:w16sdtfl="http://schemas.microsoft.com/office/word/2024/wordml/sdtformatlock" xmlns:w16se="http://schemas.microsoft.com/office/word/2015/wordml/symex" xmlns:wpg="http://schemas.microsoft.com/office/word/2010/wordprocessingGroup" xmlns:wpi="http://schemas.microsoft.com/office/word/2010/wordprocessingInk" xmlns:wne="http://schemas.microsoft.com/office/word/2006/wordml" xmlns:wps="http://schemas.microsoft.com/office/word/2010/wordprocessingShape" mc:Ignorable="w14 w15 w16se w16cid w16 w16cex w16sdtdh w16sdtfl w16du wp14">
   <w:body>
     <w:p>
       <w:pPr>
@@ -15,51 +15,64 @@
       <w:pPr>
         <w:pStyle w:val="ReportTitle"/>
       </w:pPr>
-      <w:sdt>
-        <w:sdtPr>
-          <w:alias w:val="Project Title"/>
-          <w:tag w:val="PROJECT_TITLE"/>
-          <w:id w:val="62026001"/>
-          <w:temporary/>
-          <w:showingPlcHdr/>
-          <w:text w:multiLine="1"/>
-        </w:sdtPr>
-        <w:sdtContent>
-          <w:r>
-            <w:rPr>
-              <w:color w:val="666666"/>
-            </w:rPr>
-            <w:t>[Project title — five-page main-content limit]</w:t>
-          </w:r>
-        </w:sdtContent>
-      </w:sdt>
+      <w:r>
+        <w:t xml:space="preserve">Using Online Customer Ratings to Examine </w:t>
+      </w:r>
+    </w:p>
+    <w:p>
+      <w:pPr>
+        <w:pStyle w:val="ReportTitle"/>
+      </w:pPr>
+      <w:r>
+        <w:t>Restaurant Health Inspection Results</w:t>
+      </w:r>
     </w:p>
     <w:p>
       <w:pPr>
         <w:pStyle w:val="TeamMembers"/>
+        <w:rPr>
+          <w:lang w:val="es-ES"/>
+        </w:rPr>
       </w:pPr>
-      <w:sdt>
-        <w:sdtPr>
-          <w:alias w:val="Team Members"/>
-          <w:tag w:val="TEAM_MEMBERS"/>
-          <w:id w:val="62026002"/>
-          <w:temporary/>
-          <w:showingPlcHdr/>
-          <w:text w:multiLine="1"/>
-        </w:sdtPr>
-        <w:sdtContent>
-          <w:r>
-            <w:rPr>
-              <w:color w:val="666666"/>
-            </w:rPr>
-            <w:t>[Team member names]</w:t>
-          </w:r>
-        </w:sdtContent>
-      </w:sdt>
+      <w:r>
+        <w:rPr>
+          <w:lang w:val="es-ES"/>
+        </w:rPr>
+        <w:t xml:space="preserve">Raffaella Alpaca, Helen Ayalew, </w:t>
+      </w:r>
+      <w:proofErr w:type="spellStart"/>
+      <w:r>
+        <w:rPr>
+          <w:lang w:val="es-ES"/>
+        </w:rPr>
+        <w:t>A</w:t>
+      </w:r>
+      <w:r>
+        <w:rPr>
+          <w:lang w:val="es-ES"/>
+        </w:rPr>
+        <w:t>ngel</w:t>
+      </w:r>
+      <w:proofErr w:type="spellEnd"/>
+      <w:r>
+        <w:rPr>
+          <w:lang w:val="es-ES"/>
+        </w:rPr>
+        <w:t xml:space="preserve"> P</w:t>
+      </w:r>
+      <w:r>
+        <w:rPr>
+          <w:lang w:val="es-ES"/>
+        </w:rPr>
+        <w:t>avu</w:t>
+      </w:r>
     </w:p>
     <w:p>
       <w:pPr>
         <w:spacing w:line="20" w:lineRule="exact"/>
+        <w:rPr>
+          <w:lang w:val="es-ES"/>
+        </w:rPr>
         <w:sectPr>
           <w:footerReference w:type="default" r:id="rId8"/>
           <w:pgSz w:w="12240" w:h="15840"/>
@@ -90,6 +103,7 @@
           <w:showingPlcHdr/>
           <w:text w:multiLine="1"/>
         </w:sdtPr>
+        <w:sdtEndPr/>
         <w:sdtContent>
           <w:r>
             <w:rPr>
@@ -121,6 +135,7 @@
           <w:showingPlcHdr/>
           <w:text w:multiLine="1"/>
         </w:sdtPr>
+        <w:sdtEndPr/>
         <w:sdtContent>
           <w:r>
             <w:rPr>
@@ -152,6 +167,7 @@
           <w:showingPlcHdr/>
           <w:text w:multiLine="1"/>
         </w:sdtPr>
+        <w:sdtEndPr/>
         <w:sdtContent>
           <w:r>
             <w:rPr>
@@ -183,6 +199,7 @@
           <w:showingPlcHdr/>
           <w:text w:multiLine="1"/>
         </w:sdtPr>
+        <w:sdtEndPr/>
         <w:sdtContent>
           <w:r>
             <w:rPr>
@@ -214,6 +231,7 @@
           <w:showingPlcHdr/>
           <w:text w:multiLine="1"/>
         </w:sdtPr>
+        <w:sdtEndPr/>
         <w:sdtContent>
           <w:r>
             <w:rPr>
@@ -245,6 +263,7 @@
           <w:showingPlcHdr/>
           <w:text w:multiLine="1"/>
         </w:sdtPr>
+        <w:sdtEndPr/>
         <w:sdtContent>
           <w:r>
             <w:rPr>
@@ -276,6 +295,7 @@
           <w:showingPlcHdr/>
           <w:text w:multiLine="1"/>
         </w:sdtPr>
+        <w:sdtEndPr/>
         <w:sdtContent>
           <w:r>
             <w:rPr>
@@ -307,6 +327,7 @@
           <w:showingPlcHdr/>
           <w:text w:multiLine="1"/>
         </w:sdtPr>
+        <w:sdtEndPr/>
         <w:sdtContent>
           <w:r>
             <w:rPr>
@@ -329,6 +350,7 @@
           <w:temporary/>
           <w:picture/>
         </w:sdtPr>
+        <w:sdtEndPr/>
         <w:sdtContent>
           <w:r>
             <w:rPr>
@@ -386,6 +408,7 @@
           <w:showingPlcHdr/>
           <w:text w:multiLine="1"/>
         </w:sdtPr>
+        <w:sdtEndPr/>
         <w:sdtContent>
           <w:r>
             <w:rPr>
@@ -417,6 +440,7 @@
           <w:showingPlcHdr/>
           <w:text w:multiLine="1"/>
         </w:sdtPr>
+        <w:sdtEndPr/>
         <w:sdtContent>
           <w:r>
             <w:rPr>
@@ -448,6 +472,7 @@
           <w:showingPlcHdr/>
           <w:text w:multiLine="1"/>
         </w:sdtPr>
+        <w:sdtEndPr/>
         <w:sdtContent>
           <w:r>
             <w:rPr>
@@ -481,6 +506,7 @@
           <w:showingPlcHdr/>
           <w:text w:multiLine="1"/>
         </w:sdtPr>
+        <w:sdtEndPr/>
         <w:sdtContent>
           <w:r>
             <w:rPr>
@@ -512,6 +538,7 @@
           <w:showingPlcHdr/>
           <w:text w:multiLine="1"/>
         </w:sdtPr>
+        <w:sdtEndPr/>
         <w:sdtContent>
           <w:r>
             <w:rPr>
@@ -535,7 +562,7 @@
 </file>
 
 <file path=word/endnotes.xml><?xml version="1.0" encoding="utf-8"?>
-<w:endnotes xmlns:wpc="http://schemas.microsoft.com/office/word/2010/wordprocessingCanvas" xmlns:cx="http://schemas.microsoft.com/office/drawing/2014/chartex" xmlns:cx1="http://schemas.microsoft.com/office/drawing/2015/9/8/chartex" xmlns:cx2="http://schemas.microsoft.com/office/drawing/2015/10/21/chartex" xmlns:cx3="http://schemas.microsoft.com/office/drawing/2016/5/9/chartex" xmlns:cx4="http://schemas.microsoft.com/office/drawing/2016/5/10/chartex" xmlns:cx5="http://schemas.microsoft.com/office/drawing/2016/5/11/chartex" xmlns:cx6="http://schemas.microsoft.com/office/drawing/2016/5/12/chartex" xmlns:cx7="http://schemas.microsoft.com/office/drawing/2016/5/13/chartex" xmlns:cx8="http://schemas.microsoft.com/office/drawing/2016/5/14/chartex" xmlns:mc="http://schemas.openxmlformats.org/markup-compatibility/2006" xmlns:m="http://schemas.openxmlformats.org/officeDocument/2006/math" xmlns:aink="http://schemas.microsoft.com/office/drawing/2016/ink" xmlns:am3d="http://schemas.microsoft.com/office/drawing/2017/model3d" xmlns:oel="http://schemas.microsoft.com/office/2019/extlst" xmlns:r="http://schemas.openxmlformats.org/officeDocument/2006/relationships" xmlns:wp14="http://schemas.microsoft.com/office/word/2010/wordprocessingDrawing" xmlns:wp="http://schemas.openxmlformats.org/drawingml/2006/wordprocessingDrawing" xmlns:wpg="http://schemas.microsoft.com/office/word/2010/wordprocessingGroup" xmlns:wpi="http://schemas.microsoft.com/office/word/2010/wordprocessingInk" xmlns:wps="http://schemas.microsoft.com/office/word/2010/wordprocessingShape" xmlns:o="urn:schemas-microsoft-com:office:office" xmlns:v="urn:schemas-microsoft-com:vml" xmlns:w10="urn:schemas-microsoft-com:office:word" xmlns:w="http://schemas.openxmlformats.org/wordprocessingml/2006/main" xmlns:w14="http://schemas.microsoft.com/office/word/2010/wordml" xmlns:w15="http://schemas.microsoft.com/office/word/2012/wordml" xmlns:w16cei="http://schemas.microsoft.com/office/word/2026/wordml/cei" xmlns:w16cex="http://schemas.microsoft.com/office/word/2018/wordml/cex" xmlns:w16cid="http://schemas.microsoft.com/office/word/2016/wordml/cid" xmlns:w16="http://schemas.microsoft.com/office/word/2018/wordml" xmlns:w16sdtdh="http://schemas.microsoft.com/office/word/2020/wordml/sdtdatahash" xmlns:w16sdtfl="http://schemas.microsoft.com/office/word/2024/wordml/sdtformatlock" xmlns:w16se="http://schemas.microsoft.com/office/word/2015/wordml/symex" xmlns:w16du="http://schemas.microsoft.com/office/word/2023/wordml/word16du" xmlns:wne="http://schemas.microsoft.com/office/word/2006/wordml" mc:Ignorable="w14 w15 w16se w16cid w16 w16cex w16sdtdh w16sdtfl w16du wp14">
+<w:endnotes xmlns:wpc="http://schemas.microsoft.com/office/word/2010/wordprocessingCanvas" xmlns:cx="http://schemas.microsoft.com/office/drawing/2014/chartex" xmlns:cx1="http://schemas.microsoft.com/office/drawing/2015/9/8/chartex" xmlns:cx2="http://schemas.microsoft.com/office/drawing/2015/10/21/chartex" xmlns:cx3="http://schemas.microsoft.com/office/drawing/2016/5/9/chartex" xmlns:cx4="http://schemas.microsoft.com/office/drawing/2016/5/10/chartex" xmlns:cx5="http://schemas.microsoft.com/office/drawing/2016/5/11/chartex" xmlns:cx6="http://schemas.microsoft.com/office/drawing/2016/5/12/chartex" xmlns:cx7="http://schemas.microsoft.com/office/drawing/2016/5/13/chartex" xmlns:cx8="http://schemas.microsoft.com/office/drawing/2016/5/14/chartex" xmlns:mc="http://schemas.openxmlformats.org/markup-compatibility/2006" xmlns:aink="http://schemas.microsoft.com/office/drawing/2016/ink" xmlns:am3d="http://schemas.microsoft.com/office/drawing/2017/model3d" xmlns:o="urn:schemas-microsoft-com:office:office" xmlns:oel="http://schemas.microsoft.com/office/2019/extlst" xmlns:r="http://schemas.openxmlformats.org/officeDocument/2006/relationships" xmlns:m="http://schemas.openxmlformats.org/officeDocument/2006/math" xmlns:v="urn:schemas-microsoft-com:vml" xmlns:wp14="http://schemas.microsoft.com/office/word/2010/wordprocessingDrawing" xmlns:wp="http://schemas.openxmlformats.org/drawingml/2006/wordprocessingDrawing" xmlns:w10="urn:schemas-microsoft-com:office:word" xmlns:w="http://schemas.openxmlformats.org/wordprocessingml/2006/main" xmlns:w14="http://schemas.microsoft.com/office/word/2010/wordml" xmlns:w15="http://schemas.microsoft.com/office/word/2012/wordml" xmlns:w16cex="http://schemas.microsoft.com/office/word/2018/wordml/cex" xmlns:w16cid="http://schemas.microsoft.com/office/word/2016/wordml/cid" xmlns:w16="http://schemas.microsoft.com/office/word/2018/wordml" xmlns:w16du="http://schemas.microsoft.com/office/word/2023/wordml/word16du" xmlns:w16sdtdh="http://schemas.microsoft.com/office/word/2020/wordml/sdtdatahash" xmlns:w16sdtfl="http://schemas.microsoft.com/office/word/2024/wordml/sdtformatlock" xmlns:w16se="http://schemas.microsoft.com/office/word/2015/wordml/symex" xmlns:wpg="http://schemas.microsoft.com/office/word/2010/wordprocessingGroup" xmlns:wpi="http://schemas.microsoft.com/office/word/2010/wordprocessingInk" xmlns:wne="http://schemas.microsoft.com/office/word/2006/wordml" xmlns:wps="http://schemas.microsoft.com/office/word/2010/wordprocessingShape" mc:Ignorable="w14 w15 w16se w16cid w16 w16cex w16sdtdh w16sdtfl w16du wp14">
   <w:endnote w:type="separator" w:id="-1">
     <w:p>
       <w:pPr>
@@ -560,7 +587,7 @@
 </file>
 
 <file path=word/footer1.xml><?xml version="1.0" encoding="utf-8"?>
-<w:ftr xmlns:wpc="http://schemas.microsoft.com/office/word/2010/wordprocessingCanvas" xmlns:cx="http://schemas.microsoft.com/office/drawing/2014/chartex" xmlns:cx1="http://schemas.microsoft.com/office/drawing/2015/9/8/chartex" xmlns:cx2="http://schemas.microsoft.com/office/drawing/2015/10/21/chartex" xmlns:cx3="http://schemas.microsoft.com/office/drawing/2016/5/9/chartex" xmlns:cx4="http://schemas.microsoft.com/office/drawing/2016/5/10/chartex" xmlns:cx5="http://schemas.microsoft.com/office/drawing/2016/5/11/chartex" xmlns:cx6="http://schemas.microsoft.com/office/drawing/2016/5/12/chartex" xmlns:cx7="http://schemas.microsoft.com/office/drawing/2016/5/13/chartex" xmlns:cx8="http://schemas.microsoft.com/office/drawing/2016/5/14/chartex" xmlns:mc="http://schemas.openxmlformats.org/markup-compatibility/2006" xmlns:m="http://schemas.openxmlformats.org/officeDocument/2006/math" xmlns:aink="http://schemas.microsoft.com/office/drawing/2016/ink" xmlns:am3d="http://schemas.microsoft.com/office/drawing/2017/model3d" xmlns:oel="http://schemas.microsoft.com/office/2019/extlst" xmlns:r="http://schemas.openxmlformats.org/officeDocument/2006/relationships" xmlns:wp14="http://schemas.microsoft.com/office/word/2010/wordprocessingDrawing" xmlns:wp="http://schemas.openxmlformats.org/drawingml/2006/wordprocessingDrawing" xmlns:wpg="http://schemas.microsoft.com/office/word/2010/wordprocessingGroup" xmlns:wpi="http://schemas.microsoft.com/office/word/2010/wordprocessingInk" xmlns:wps="http://schemas.microsoft.com/office/word/2010/wordprocessingShape" xmlns:o="urn:schemas-microsoft-com:office:office" xmlns:v="urn:schemas-microsoft-com:vml" xmlns:w10="urn:schemas-microsoft-com:office:word" xmlns:w="http://schemas.openxmlformats.org/wordprocessingml/2006/main" xmlns:w14="http://schemas.microsoft.com/office/word/2010/wordml" xmlns:w15="http://schemas.microsoft.com/office/word/2012/wordml" xmlns:w16cei="http://schemas.microsoft.com/office/word/2026/wordml/cei" xmlns:w16cex="http://schemas.microsoft.com/office/word/2018/wordml/cex" xmlns:w16cid="http://schemas.microsoft.com/office/word/2016/wordml/cid" xmlns:w16="http://schemas.microsoft.com/office/word/2018/wordml" xmlns:w16sdtdh="http://schemas.microsoft.com/office/word/2020/wordml/sdtdatahash" xmlns:w16sdtfl="http://schemas.microsoft.com/office/word/2024/wordml/sdtformatlock" xmlns:w16se="http://schemas.microsoft.com/office/word/2015/wordml/symex" xmlns:w16du="http://schemas.microsoft.com/office/word/2023/wordml/word16du" xmlns:wne="http://schemas.microsoft.com/office/word/2006/wordml" mc:Ignorable="w14 w15 w16se w16cid w16 w16cex w16sdtdh w16sdtfl w16du wp14">
+<w:ftr xmlns:wpc="http://schemas.microsoft.com/office/word/2010/wordprocessingCanvas" xmlns:cx="http://schemas.microsoft.com/office/drawing/2014/chartex" xmlns:cx1="http://schemas.microsoft.com/office/drawing/2015/9/8/chartex" xmlns:cx2="http://schemas.microsoft.com/office/drawing/2015/10/21/chartex" xmlns:cx3="http://schemas.microsoft.com/office/drawing/2016/5/9/chartex" xmlns:cx4="http://schemas.microsoft.com/office/drawing/2016/5/10/chartex" xmlns:cx5="http://schemas.microsoft.com/office/drawing/2016/5/11/chartex" xmlns:cx6="http://schemas.microsoft.com/office/drawing/2016/5/12/chartex" xmlns:cx7="http://schemas.microsoft.com/office/drawing/2016/5/13/chartex" xmlns:cx8="http://schemas.microsoft.com/office/drawing/2016/5/14/chartex" xmlns:mc="http://schemas.openxmlformats.org/markup-compatibility/2006" xmlns:aink="http://schemas.microsoft.com/office/drawing/2016/ink" xmlns:am3d="http://schemas.microsoft.com/office/drawing/2017/model3d" xmlns:o="urn:schemas-microsoft-com:office:office" xmlns:oel="http://schemas.microsoft.com/office/2019/extlst" xmlns:r="http://schemas.openxmlformats.org/officeDocument/2006/relationships" xmlns:m="http://schemas.openxmlformats.org/officeDocument/2006/math" xmlns:v="urn:schemas-microsoft-com:vml" xmlns:wp14="http://schemas.microsoft.com/office/word/2010/wordprocessingDrawing" xmlns:wp="http://schemas.openxmlformats.org/drawingml/2006/wordprocessingDrawing" xmlns:w10="urn:schemas-microsoft-com:office:word" xmlns:w="http://schemas.openxmlformats.org/wordprocessingml/2006/main" xmlns:w14="http://schemas.microsoft.com/office/word/2010/wordml" xmlns:w15="http://schemas.microsoft.com/office/word/2012/wordml" xmlns:w16cex="http://schemas.microsoft.com/office/word/2018/wordml/cex" xmlns:w16cid="http://schemas.microsoft.com/office/word/2016/wordml/cid" xmlns:w16="http://schemas.microsoft.com/office/word/2018/wordml" xmlns:w16du="http://schemas.microsoft.com/office/word/2023/wordml/word16du" xmlns:w16sdtdh="http://schemas.microsoft.com/office/word/2020/wordml/sdtdatahash" xmlns:w16sdtfl="http://schemas.microsoft.com/office/word/2024/wordml/sdtformatlock" xmlns:w16se="http://schemas.microsoft.com/office/word/2015/wordml/symex" xmlns:wpg="http://schemas.microsoft.com/office/word/2010/wordprocessingGroup" xmlns:wpi="http://schemas.microsoft.com/office/word/2010/wordprocessingInk" xmlns:wne="http://schemas.microsoft.com/office/word/2006/wordml" xmlns:wps="http://schemas.microsoft.com/office/word/2010/wordprocessingShape" mc:Ignorable="w14 w15 w16se w16cid w16 w16cex w16sdtdh w16sdtfl w16du wp14">
   <w:p>
     <w:pPr>
       <w:pStyle w:val="Footer"/>
@@ -589,7 +616,7 @@
 </file>
 
 <file path=word/footer2.xml><?xml version="1.0" encoding="utf-8"?>
-<w:ftr xmlns:wpc="http://schemas.microsoft.com/office/word/2010/wordprocessingCanvas" xmlns:cx="http://schemas.microsoft.com/office/drawing/2014/chartex" xmlns:cx1="http://schemas.microsoft.com/office/drawing/2015/9/8/chartex" xmlns:cx2="http://schemas.microsoft.com/office/drawing/2015/10/21/chartex" xmlns:cx3="http://schemas.microsoft.com/office/drawing/2016/5/9/chartex" xmlns:cx4="http://schemas.microsoft.com/office/drawing/2016/5/10/chartex" xmlns:cx5="http://schemas.microsoft.com/office/drawing/2016/5/11/chartex" xmlns:cx6="http://schemas.microsoft.com/office/drawing/2016/5/12/chartex" xmlns:cx7="http://schemas.microsoft.com/office/drawing/2016/5/13/chartex" xmlns:cx8="http://schemas.microsoft.com/office/drawing/2016/5/14/chartex" xmlns:mc="http://schemas.openxmlformats.org/markup-compatibility/2006" xmlns:m="http://schemas.openxmlformats.org/officeDocument/2006/math" xmlns:aink="http://schemas.microsoft.com/office/drawing/2016/ink" xmlns:am3d="http://schemas.microsoft.com/office/drawing/2017/model3d" xmlns:oel="http://schemas.microsoft.com/office/2019/extlst" xmlns:r="http://schemas.openxmlformats.org/officeDocument/2006/relationships" xmlns:wp14="http://schemas.microsoft.com/office/word/2010/wordprocessingDrawing" xmlns:wp="http://schemas.openxmlformats.org/drawingml/2006/wordprocessingDrawing" xmlns:wpg="http://schemas.microsoft.com/office/word/2010/wordprocessingGroup" xmlns:wpi="http://schemas.microsoft.com/office/word/2010/wordprocessingInk" xmlns:wps="http://schemas.microsoft.com/office/word/2010/wordprocessingShape" xmlns:o="urn:schemas-microsoft-com:office:office" xmlns:v="urn:schemas-microsoft-com:vml" xmlns:w10="urn:schemas-microsoft-com:office:word" xmlns:w="http://schemas.openxmlformats.org/wordprocessingml/2006/main" xmlns:w14="http://schemas.microsoft.com/office/word/2010/wordml" xmlns:w15="http://schemas.microsoft.com/office/word/2012/wordml" xmlns:w16cei="http://schemas.microsoft.com/office/word/2026/wordml/cei" xmlns:w16cex="http://schemas.microsoft.com/office/word/2018/wordml/cex" xmlns:w16cid="http://schemas.microsoft.com/office/word/2016/wordml/cid" xmlns:w16="http://schemas.microsoft.com/office/word/2018/wordml" xmlns:w16sdtdh="http://schemas.microsoft.com/office/word/2020/wordml/sdtdatahash" xmlns:w16sdtfl="http://schemas.microsoft.com/office/word/2024/wordml/sdtformatlock" xmlns:w16se="http://schemas.microsoft.com/office/word/2015/wordml/symex" xmlns:w16du="http://schemas.microsoft.com/office/word/2023/wordml/word16du" xmlns:wne="http://schemas.microsoft.com/office/word/2006/wordml" mc:Ignorable="w14 w15 w16se w16cid w16 w16cex w16sdtdh w16sdtfl w16du wp14">
+<w:ftr xmlns:wpc="http://schemas.microsoft.com/office/word/2010/wordprocessingCanvas" xmlns:cx="http://schemas.microsoft.com/office/drawing/2014/chartex" xmlns:cx1="http://schemas.microsoft.com/office/drawing/2015/9/8/chartex" xmlns:cx2="http://schemas.microsoft.com/office/drawing/2015/10/21/chartex" xmlns:cx3="http://schemas.microsoft.com/office/drawing/2016/5/9/chartex" xmlns:cx4="http://schemas.microsoft.com/office/drawing/2016/5/10/chartex" xmlns:cx5="http://schemas.microsoft.com/office/drawing/2016/5/11/chartex" xmlns:cx6="http://schemas.microsoft.com/office/drawing/2016/5/12/chartex" xmlns:cx7="http://schemas.microsoft.com/office/drawing/2016/5/13/chartex" xmlns:cx8="http://schemas.microsoft.com/office/drawing/2016/5/14/chartex" xmlns:mc="http://schemas.openxmlformats.org/markup-compatibility/2006" xmlns:aink="http://schemas.microsoft.com/office/drawing/2016/ink" xmlns:am3d="http://schemas.microsoft.com/office/drawing/2017/model3d" xmlns:o="urn:schemas-microsoft-com:office:office" xmlns:oel="http://schemas.microsoft.com/office/2019/extlst" xmlns:r="http://schemas.openxmlformats.org/officeDocument/2006/relationships" xmlns:m="http://schemas.openxmlformats.org/officeDocument/2006/math" xmlns:v="urn:schemas-microsoft-com:vml" xmlns:wp14="http://schemas.microsoft.com/office/word/2010/wordprocessingDrawing" xmlns:wp="http://schemas.openxmlformats.org/drawingml/2006/wordprocessingDrawing" xmlns:w10="urn:schemas-microsoft-com:office:word" xmlns:w="http://schemas.openxmlformats.org/wordprocessingml/2006/main" xmlns:w14="http://schemas.microsoft.com/office/word/2010/wordml" xmlns:w15="http://schemas.microsoft.com/office/word/2012/wordml" xmlns:w16cex="http://schemas.microsoft.com/office/word/2018/wordml/cex" xmlns:w16cid="http://schemas.microsoft.com/office/word/2016/wordml/cid" xmlns:w16="http://schemas.microsoft.com/office/word/2018/wordml" xmlns:w16du="http://schemas.microsoft.com/office/word/2023/wordml/word16du" xmlns:w16sdtdh="http://schemas.microsoft.com/office/word/2020/wordml/sdtdatahash" xmlns:w16sdtfl="http://schemas.microsoft.com/office/word/2024/wordml/sdtformatlock" xmlns:w16se="http://schemas.microsoft.com/office/word/2015/wordml/symex" xmlns:wpg="http://schemas.microsoft.com/office/word/2010/wordprocessingGroup" xmlns:wpi="http://schemas.microsoft.com/office/word/2010/wordprocessingInk" xmlns:wne="http://schemas.microsoft.com/office/word/2006/wordml" xmlns:wps="http://schemas.microsoft.com/office/word/2010/wordprocessingShape" mc:Ignorable="w14 w15 w16se w16cid w16 w16cex w16sdtdh w16sdtfl w16du wp14">
   <w:p>
     <w:pPr>
       <w:pStyle w:val="Footer"/>
@@ -618,7 +645,7 @@
 </file>
 
 <file path=word/footnotes.xml><?xml version="1.0" encoding="utf-8"?>
-<w:footnotes xmlns:wpc="http://schemas.microsoft.com/office/word/2010/wordprocessingCanvas" xmlns:cx="http://schemas.microsoft.com/office/drawing/2014/chartex" xmlns:cx1="http://schemas.microsoft.com/office/drawing/2015/9/8/chartex" xmlns:cx2="http://schemas.microsoft.com/office/drawing/2015/10/21/chartex" xmlns:cx3="http://schemas.microsoft.com/office/drawing/2016/5/9/chartex" xmlns:cx4="http://schemas.microsoft.com/office/drawing/2016/5/10/chartex" xmlns:cx5="http://schemas.microsoft.com/office/drawing/2016/5/11/chartex" xmlns:cx6="http://schemas.microsoft.com/office/drawing/2016/5/12/chartex" xmlns:cx7="http://schemas.microsoft.com/office/drawing/2016/5/13/chartex" xmlns:cx8="http://schemas.microsoft.com/office/drawing/2016/5/14/chartex" xmlns:mc="http://schemas.openxmlformats.org/markup-compatibility/2006" xmlns:m="http://schemas.openxmlformats.org/officeDocument/2006/math" xmlns:aink="http://schemas.microsoft.com/office/drawing/2016/ink" xmlns:am3d="http://schemas.microsoft.com/office/drawing/2017/model3d" xmlns:oel="http://schemas.microsoft.com/office/2019/extlst" xmlns:r="http://schemas.openxmlformats.org/officeDocument/2006/relationships" xmlns:wp14="http://schemas.microsoft.com/office/word/2010/wordprocessingDrawing" xmlns:wp="http://schemas.openxmlformats.org/drawingml/2006/wordprocessingDrawing" xmlns:wpg="http://schemas.microsoft.com/office/word/2010/wordprocessingGroup" xmlns:wpi="http://schemas.microsoft.com/office/word/2010/wordprocessingInk" xmlns:wps="http://schemas.microsoft.com/office/word/2010/wordprocessingShape" xmlns:o="urn:schemas-microsoft-com:office:office" xmlns:v="urn:schemas-microsoft-com:vml" xmlns:w10="urn:schemas-microsoft-com:office:word" xmlns:w="http://schemas.openxmlformats.org/wordprocessingml/2006/main" xmlns:w14="http://schemas.microsoft.com/office/word/2010/wordml" xmlns:w15="http://schemas.microsoft.com/office/word/2012/wordml" xmlns:w16cei="http://schemas.microsoft.com/office/word/2026/wordml/cei" xmlns:w16cex="http://schemas.microsoft.com/office/word/2018/wordml/cex" xmlns:w16cid="http://schemas.microsoft.com/office/word/2016/wordml/cid" xmlns:w16="http://schemas.microsoft.com/office/word/2018/wordml" xmlns:w16sdtdh="http://schemas.microsoft.com/office/word/2020/wordml/sdtdatahash" xmlns:w16sdtfl="http://schemas.microsoft.com/office/word/2024/wordml/sdtformatlock" xmlns:w16se="http://schemas.microsoft.com/office/word/2015/wordml/symex" xmlns:w16du="http://schemas.microsoft.com/office/word/2023/wordml/word16du" xmlns:wne="http://schemas.microsoft.com/office/word/2006/wordml" mc:Ignorable="w14 w15 w16se w16cid w16 w16cex w16sdtdh w16sdtfl w16du wp14">
+<w:footnotes xmlns:wpc="http://schemas.microsoft.com/office/word/2010/wordprocessingCanvas" xmlns:cx="http://schemas.microsoft.com/office/drawing/2014/chartex" xmlns:cx1="http://schemas.microsoft.com/office/drawing/2015/9/8/chartex" xmlns:cx2="http://schemas.microsoft.com/office/drawing/2015/10/21/chartex" xmlns:cx3="http://schemas.microsoft.com/office/drawing/2016/5/9/chartex" xmlns:cx4="http://schemas.microsoft.com/office/drawing/2016/5/10/chartex" xmlns:cx5="http://schemas.microsoft.com/office/drawing/2016/5/11/chartex" xmlns:cx6="http://schemas.microsoft.com/office/drawing/2016/5/12/chartex" xmlns:cx7="http://schemas.microsoft.com/office/drawing/2016/5/13/chartex" xmlns:cx8="http://schemas.microsoft.com/office/drawing/2016/5/14/chartex" xmlns:mc="http://schemas.openxmlformats.org/markup-compatibility/2006" xmlns:aink="http://schemas.microsoft.com/office/drawing/2016/ink" xmlns:am3d="http://schemas.microsoft.com/office/drawing/2017/model3d" xmlns:o="urn:schemas-microsoft-com:office:office" xmlns:oel="http://schemas.microsoft.com/office/2019/extlst" xmlns:r="http://schemas.openxmlformats.org/officeDocument/2006/relationships" xmlns:m="http://schemas.openxmlformats.org/officeDocument/2006/math" xmlns:v="urn:schemas-microsoft-com:vml" xmlns:wp14="http://schemas.microsoft.com/office/word/2010/wordprocessingDrawing" xmlns:wp="http://schemas.openxmlformats.org/drawingml/2006/wordprocessingDrawing" xmlns:w10="urn:schemas-microsoft-com:office:word" xmlns:w="http://schemas.openxmlformats.org/wordprocessingml/2006/main" xmlns:w14="http://schemas.microsoft.com/office/word/2010/wordml" xmlns:w15="http://schemas.microsoft.com/office/word/2012/wordml" xmlns:w16cex="http://schemas.microsoft.com/office/word/2018/wordml/cex" xmlns:w16cid="http://schemas.microsoft.com/office/word/2016/wordml/cid" xmlns:w16="http://schemas.microsoft.com/office/word/2018/wordml" xmlns:w16du="http://schemas.microsoft.com/office/word/2023/wordml/word16du" xmlns:w16sdtdh="http://schemas.microsoft.com/office/word/2020/wordml/sdtdatahash" xmlns:w16sdtfl="http://schemas.microsoft.com/office/word/2024/wordml/sdtformatlock" xmlns:w16se="http://schemas.microsoft.com/office/word/2015/wordml/symex" xmlns:wpg="http://schemas.microsoft.com/office/word/2010/wordprocessingGroup" xmlns:wpi="http://schemas.microsoft.com/office/word/2010/wordprocessingInk" xmlns:wne="http://schemas.microsoft.com/office/word/2006/wordml" xmlns:wps="http://schemas.microsoft.com/office/word/2010/wordprocessingShape" mc:Ignorable="w14 w15 w16se w16cid w16 w16cex w16sdtdh w16sdtfl w16du wp14">
   <w:footnote w:type="separator" w:id="-1">
     <w:p>
       <w:pPr>
@@ -643,7 +670,7 @@
 </file>
 
 <file path=word/numbering.xml><?xml version="1.0" encoding="utf-8"?>
-<w:numbering xmlns:wpc="http://schemas.microsoft.com/office/word/2010/wordprocessingCanvas" xmlns:cx="http://schemas.microsoft.com/office/drawing/2014/chartex" xmlns:cx1="http://schemas.microsoft.com/office/drawing/2015/9/8/chartex" xmlns:cx2="http://schemas.microsoft.com/office/drawing/2015/10/21/chartex" xmlns:cx3="http://schemas.microsoft.com/office/drawing/2016/5/9/chartex" xmlns:cx4="http://schemas.microsoft.com/office/drawing/2016/5/10/chartex" xmlns:cx5="http://schemas.microsoft.com/office/drawing/2016/5/11/chartex" xmlns:cx6="http://schemas.microsoft.com/office/drawing/2016/5/12/chartex" xmlns:cx7="http://schemas.microsoft.com/office/drawing/2016/5/13/chartex" xmlns:cx8="http://schemas.microsoft.com/office/drawing/2016/5/14/chartex" xmlns:mc="http://schemas.openxmlformats.org/markup-compatibility/2006" xmlns:m="http://schemas.openxmlformats.org/officeDocument/2006/math" xmlns:aink="http://schemas.microsoft.com/office/drawing/2016/ink" xmlns:am3d="http://schemas.microsoft.com/office/drawing/2017/model3d" xmlns:oel="http://schemas.microsoft.com/office/2019/extlst" xmlns:r="http://schemas.openxmlformats.org/officeDocument/2006/relationships" xmlns:wp14="http://schemas.microsoft.com/office/word/2010/wordprocessingDrawing" xmlns:wp="http://schemas.openxmlformats.org/drawingml/2006/wordprocessingDrawing" xmlns:wpg="http://schemas.microsoft.com/office/word/2010/wordprocessingGroup" xmlns:wpi="http://schemas.microsoft.com/office/word/2010/wordprocessingInk" xmlns:wps="http://schemas.microsoft.com/office/word/2010/wordprocessingShape" xmlns:o="urn:schemas-microsoft-com:office:office" xmlns:v="urn:schemas-microsoft-com:vml" xmlns:w10="urn:schemas-microsoft-com:office:word" xmlns:w="http://schemas.openxmlformats.org/wordprocessingml/2006/main" xmlns:w14="http://schemas.microsoft.com/office/word/2010/wordml" xmlns:w15="http://schemas.microsoft.com/office/word/2012/wordml" xmlns:w16cei="http://schemas.microsoft.com/office/word/2026/wordml/cei" xmlns:w16cex="http://schemas.microsoft.com/office/word/2018/wordml/cex" xmlns:w16cid="http://schemas.microsoft.com/office/word/2016/wordml/cid" xmlns:w16="http://schemas.microsoft.com/office/word/2018/wordml" xmlns:w16sdtdh="http://schemas.microsoft.com/office/word/2020/wordml/sdtdatahash" xmlns:w16sdtfl="http://schemas.microsoft.com/office/word/2024/wordml/sdtformatlock" xmlns:w16se="http://schemas.microsoft.com/office/word/2015/wordml/symex" xmlns:w16du="http://schemas.microsoft.com/office/word/2023/wordml/word16du" xmlns:wne="http://schemas.microsoft.com/office/word/2006/wordml" mc:Ignorable="w14 w15 w16se w16cid w16 w16cex w16sdtdh w16sdtfl w16du wp14">
+<w:numbering xmlns:wpc="http://schemas.microsoft.com/office/word/2010/wordprocessingCanvas" xmlns:cx="http://schemas.microsoft.com/office/drawing/2014/chartex" xmlns:cx1="http://schemas.microsoft.com/office/drawing/2015/9/8/chartex" xmlns:cx2="http://schemas.microsoft.com/office/drawing/2015/10/21/chartex" xmlns:cx3="http://schemas.microsoft.com/office/drawing/2016/5/9/chartex" xmlns:cx4="http://schemas.microsoft.com/office/drawing/2016/5/10/chartex" xmlns:cx5="http://schemas.microsoft.com/office/drawing/2016/5/11/chartex" xmlns:cx6="http://schemas.microsoft.com/office/drawing/2016/5/12/chartex" xmlns:cx7="http://schemas.microsoft.com/office/drawing/2016/5/13/chartex" xmlns:cx8="http://schemas.microsoft.com/office/drawing/2016/5/14/chartex" xmlns:mc="http://schemas.openxmlformats.org/markup-compatibility/2006" xmlns:aink="http://schemas.microsoft.com/office/drawing/2016/ink" xmlns:am3d="http://schemas.microsoft.com/office/drawing/2017/model3d" xmlns:o="urn:schemas-microsoft-com:office:office" xmlns:oel="http://schemas.microsoft.com/office/2019/extlst" xmlns:r="http://schemas.openxmlformats.org/officeDocument/2006/relationships" xmlns:m="http://schemas.openxmlformats.org/officeDocument/2006/math" xmlns:v="urn:schemas-microsoft-com:vml" xmlns:wp14="http://schemas.microsoft.com/office/word/2010/wordprocessingDrawing" xmlns:wp="http://schemas.openxmlformats.org/drawingml/2006/wordprocessingDrawing" xmlns:w10="urn:schemas-microsoft-com:office:word" xmlns:w="http://schemas.openxmlformats.org/wordprocessingml/2006/main" xmlns:w14="http://schemas.microsoft.com/office/word/2010/wordml" xmlns:w15="http://schemas.microsoft.com/office/word/2012/wordml" xmlns:w16cex="http://schemas.microsoft.com/office/word/2018/wordml/cex" xmlns:w16cid="http://schemas.microsoft.com/office/word/2016/wordml/cid" xmlns:w16="http://schemas.microsoft.com/office/word/2018/wordml" xmlns:w16du="http://schemas.microsoft.com/office/word/2023/wordml/word16du" xmlns:w16sdtdh="http://schemas.microsoft.com/office/word/2020/wordml/sdtdatahash" xmlns:w16sdtfl="http://schemas.microsoft.com/office/word/2024/wordml/sdtformatlock" xmlns:w16se="http://schemas.microsoft.com/office/word/2015/wordml/symex" xmlns:wpg="http://schemas.microsoft.com/office/word/2010/wordprocessingGroup" xmlns:wpi="http://schemas.microsoft.com/office/word/2010/wordprocessingInk" xmlns:wne="http://schemas.microsoft.com/office/word/2006/wordml" xmlns:wps="http://schemas.microsoft.com/office/word/2010/wordprocessingShape" mc:Ignorable="w14 w15 w16se w16cid w16 w16cex w16sdtdh w16sdtfl w16du wp14">
   <w:abstractNum w:abstractNumId="0" w15:restartNumberingAfterBreak="0">
     <w:nsid w:val="FFFFFF7C"/>
     <w:multiLevelType w:val="singleLevel"/>
@@ -846,7 +873,7 @@
 </file>
 
 <file path=word/styles.xml><?xml version="1.0" encoding="utf-8"?>
-<w:styles xmlns:mc="http://schemas.openxmlformats.org/markup-compatibility/2006" xmlns:r="http://schemas.openxmlformats.org/officeDocument/2006/relationships" xmlns:w="http://schemas.openxmlformats.org/wordprocessingml/2006/main" xmlns:w14="http://schemas.microsoft.com/office/word/2010/wordml" xmlns:w15="http://schemas.microsoft.com/office/word/2012/wordml" xmlns:w16cex="http://schemas.microsoft.com/office/word/2018/wordml/cex" xmlns:w16cid="http://schemas.microsoft.com/office/word/2016/wordml/cid" xmlns:w16="http://schemas.microsoft.com/office/word/2018/wordml" xmlns:w16sdtdh="http://schemas.microsoft.com/office/word/2020/wordml/sdtdatahash" xmlns:w16sdtfl="http://schemas.microsoft.com/office/word/2024/wordml/sdtformatlock" xmlns:w16se="http://schemas.microsoft.com/office/word/2015/wordml/symex" xmlns:w16du="http://schemas.microsoft.com/office/word/2023/wordml/word16du" mc:Ignorable="w14 w15 w16se w16cid w16 w16cex w16sdtdh w16sdtfl w16du">
+<w:styles xmlns:mc="http://schemas.openxmlformats.org/markup-compatibility/2006" xmlns:r="http://schemas.openxmlformats.org/officeDocument/2006/relationships" xmlns:w="http://schemas.openxmlformats.org/wordprocessingml/2006/main" xmlns:w14="http://schemas.microsoft.com/office/word/2010/wordml" xmlns:w15="http://schemas.microsoft.com/office/word/2012/wordml" xmlns:w16cex="http://schemas.microsoft.com/office/word/2018/wordml/cex" xmlns:w16cid="http://schemas.microsoft.com/office/word/2016/wordml/cid" xmlns:w16="http://schemas.microsoft.com/office/word/2018/wordml" xmlns:w16du="http://schemas.microsoft.com/office/word/2023/wordml/word16du" xmlns:w16sdtdh="http://schemas.microsoft.com/office/word/2020/wordml/sdtdatahash" xmlns:w16sdtfl="http://schemas.microsoft.com/office/word/2024/wordml/sdtformatlock" xmlns:w16se="http://schemas.microsoft.com/office/word/2015/wordml/symex" mc:Ignorable="w14 w15 w16se w16cid w16 w16cex w16sdtdh w16sdtfl w16du">
   <w:docDefaults>
     <w:rPrDefault>
       <w:rPr>
@@ -1440,7 +1467,6 @@
   <w:style w:type="character" w:default="1" w:styleId="DefaultParagraphFont">
     <w:name w:val="Default Paragraph Font"/>
     <w:uiPriority w:val="1"/>
-    <w:semiHidden/>
     <w:unhideWhenUsed/>
   </w:style>
   <w:style w:type="table" w:default="1" w:styleId="TableNormal">

</xml_diff>